<commit_message>
feat(ui): wire consumer culture (ثقافة المستهلك) end-to-end
المنصة كانت تُثري "ثقافة المستهلك" في القالب الموحّد (view.culture من
طبقة websearch) لكن الواجهة لم تكن تطلبها ولا تعرضها — فبدت "غير مرصودة"
دائماً. هذا يصل الخيط كاملاً:

- buildBody يرسل with_websearch حين يُضبط مفتاح SEARCH.
- مصدر "بحث الويب (Serper)" أُضيف لقائمة المصادر المجانية بمفتاح SEARCH.
- لوحة "ثقافة المستهلك ونبض السوق" تعرض العناوين/الروابط المرصودة، أو
  تُعلن الفجوة صراحةً (يتطلب SEARCH_API_KEY) — لا اختلاق اهتمام.
- مفاتيح i18n (AR/EN) للّوحة الجديدة.
- تجديد نماذج samples/ من مسار الـ API الحقيقي (§10.6): view.culture
  حاضر، وقسم "ثقافة المستهلك" في تقرير الورد.

Wire the culture layer the backend already produced but the UI never
requested or rendered. Gaps stay declared, never invented.

Co-Authored-By: Claude Fable 5 <noreply@anthropic.com>
Claude-Session: https://claude.ai/code/session_01MnXskdiDhR7EE8r62HjEr7
</commit_message>
<xml_diff>
--- a/samples/report_full_latest.docx
+++ b/samples/report_full_latest.docx
@@ -137,7 +137,7 @@
         <w:pStyle w:val="IntenseQuote"/>
       </w:pPr>
       <w:r>
-        <w:t>المصدر: UN Comtrade | سُحب: 2026-07-02 | ثقة: 0.0</w:t>
+        <w:t>المصدر: UN Comtrade | سُحب: 2026-07-05 | ثقة: 0.0</w:t>
       </w:r>
     </w:p>
     <w:p>
@@ -150,7 +150,7 @@
         <w:pStyle w:val="IntenseQuote"/>
       </w:pPr>
       <w:r>
-        <w:t>المصدر: UN Comtrade | سُحب: 2026-07-02 | ثقة: 0.0</w:t>
+        <w:t>المصدر: UN Comtrade | سُحب: 2026-07-05 | ثقة: 0.0</w:t>
       </w:r>
     </w:p>
     <w:p>
@@ -163,7 +163,7 @@
         <w:pStyle w:val="IntenseQuote"/>
       </w:pPr>
       <w:r>
-        <w:t>المصدر: World Bank | سُحب: 2026-07-02 | ثقة: 0.0</w:t>
+        <w:t>المصدر: World Bank | سُحب: 2026-07-05 | ثقة: 0.0</w:t>
       </w:r>
     </w:p>
     <w:p>
@@ -176,7 +176,7 @@
         <w:pStyle w:val="IntenseQuote"/>
       </w:pPr>
       <w:r>
-        <w:t>المصدر: UN Comtrade | سُحب: 2026-07-02 | ثقة: 0.0</w:t>
+        <w:t>المصدر: UN Comtrade | سُحب: 2026-07-05 | ثقة: 0.0</w:t>
       </w:r>
     </w:p>
     <w:p>
@@ -197,7 +197,7 @@
         <w:pStyle w:val="IntenseQuote"/>
       </w:pPr>
       <w:r>
-        <w:t>المصدر: UN Comtrade | سُحب: 2026-07-02 | ثقة: 0.0</w:t>
+        <w:t>المصدر: UN Comtrade | سُحب: 2026-07-05 | ثقة: 0.0</w:t>
       </w:r>
     </w:p>
     <w:p>
@@ -210,7 +210,7 @@
         <w:pStyle w:val="IntenseQuote"/>
       </w:pPr>
       <w:r>
-        <w:t>المصدر: UN Comtrade | سُحب: 2026-07-02 | ثقة: 0.0</w:t>
+        <w:t>المصدر: UN Comtrade | سُحب: 2026-07-05 | ثقة: 0.0</w:t>
       </w:r>
     </w:p>
     <w:p>
@@ -223,7 +223,7 @@
         <w:pStyle w:val="IntenseQuote"/>
       </w:pPr>
       <w:r>
-        <w:t>المصدر: World Bank | سُحب: 2026-07-02 | ثقة: 0.0</w:t>
+        <w:t>المصدر: World Bank | سُحب: 2026-07-05 | ثقة: 0.0</w:t>
       </w:r>
     </w:p>
     <w:p>
@@ -236,7 +236,7 @@
         <w:pStyle w:val="IntenseQuote"/>
       </w:pPr>
       <w:r>
-        <w:t>المصدر: UN Comtrade | سُحب: 2026-07-02 | ثقة: 0.0</w:t>
+        <w:t>المصدر: UN Comtrade | سُحب: 2026-07-05 | ثقة: 0.0</w:t>
       </w:r>
     </w:p>
     <w:p>
@@ -257,7 +257,7 @@
         <w:pStyle w:val="IntenseQuote"/>
       </w:pPr>
       <w:r>
-        <w:t>المصدر: UN Comtrade | سُحب: 2026-07-02 | ثقة: 0.0</w:t>
+        <w:t>المصدر: UN Comtrade | سُحب: 2026-07-05 | ثقة: 0.0</w:t>
       </w:r>
     </w:p>
     <w:p>
@@ -270,7 +270,7 @@
         <w:pStyle w:val="IntenseQuote"/>
       </w:pPr>
       <w:r>
-        <w:t>المصدر: UN Comtrade | سُحب: 2026-07-02 | ثقة: 0.0</w:t>
+        <w:t>المصدر: UN Comtrade | سُحب: 2026-07-05 | ثقة: 0.0</w:t>
       </w:r>
     </w:p>
     <w:p>
@@ -283,7 +283,7 @@
         <w:pStyle w:val="IntenseQuote"/>
       </w:pPr>
       <w:r>
-        <w:t>المصدر: World Bank | سُحب: 2026-07-02 | ثقة: 0.0</w:t>
+        <w:t>المصدر: World Bank | سُحب: 2026-07-05 | ثقة: 0.0</w:t>
       </w:r>
     </w:p>
     <w:p>
@@ -296,7 +296,7 @@
         <w:pStyle w:val="IntenseQuote"/>
       </w:pPr>
       <w:r>
-        <w:t>المصدر: UN Comtrade | سُحب: 2026-07-02 | ثقة: 0.0</w:t>
+        <w:t>المصدر: UN Comtrade | سُحب: 2026-07-05 | ثقة: 0.0</w:t>
       </w:r>
     </w:p>
     <w:p>
@@ -317,7 +317,7 @@
         <w:pStyle w:val="IntenseQuote"/>
       </w:pPr>
       <w:r>
-        <w:t>المصدر: UN Comtrade | سُحب: 2026-07-02 | ثقة: 0.0</w:t>
+        <w:t>المصدر: UN Comtrade | سُحب: 2026-07-05 | ثقة: 0.0</w:t>
       </w:r>
     </w:p>
     <w:p>
@@ -330,7 +330,7 @@
         <w:pStyle w:val="IntenseQuote"/>
       </w:pPr>
       <w:r>
-        <w:t>المصدر: UN Comtrade | سُحب: 2026-07-02 | ثقة: 0.0</w:t>
+        <w:t>المصدر: UN Comtrade | سُحب: 2026-07-05 | ثقة: 0.0</w:t>
       </w:r>
     </w:p>
     <w:p>
@@ -343,7 +343,7 @@
         <w:pStyle w:val="IntenseQuote"/>
       </w:pPr>
       <w:r>
-        <w:t>المصدر: World Bank | سُحب: 2026-07-02 | ثقة: 0.0</w:t>
+        <w:t>المصدر: World Bank | سُحب: 2026-07-05 | ثقة: 0.0</w:t>
       </w:r>
     </w:p>
     <w:p>
@@ -356,7 +356,7 @@
         <w:pStyle w:val="IntenseQuote"/>
       </w:pPr>
       <w:r>
-        <w:t>المصدر: UN Comtrade | سُحب: 2026-07-02 | ثقة: 0.0</w:t>
+        <w:t>المصدر: UN Comtrade | سُحب: 2026-07-05 | ثقة: 0.0</w:t>
       </w:r>
     </w:p>
     <w:p>
@@ -377,7 +377,7 @@
         <w:pStyle w:val="IntenseQuote"/>
       </w:pPr>
       <w:r>
-        <w:t>المصدر: UN Comtrade | سُحب: 2026-07-02 | ثقة: 0.0</w:t>
+        <w:t>المصدر: UN Comtrade | سُحب: 2026-07-05 | ثقة: 0.0</w:t>
       </w:r>
     </w:p>
     <w:p>
@@ -390,7 +390,7 @@
         <w:pStyle w:val="IntenseQuote"/>
       </w:pPr>
       <w:r>
-        <w:t>المصدر: UN Comtrade | سُحب: 2026-07-02 | ثقة: 0.0</w:t>
+        <w:t>المصدر: UN Comtrade | سُحب: 2026-07-05 | ثقة: 0.0</w:t>
       </w:r>
     </w:p>
     <w:p>
@@ -403,7 +403,7 @@
         <w:pStyle w:val="IntenseQuote"/>
       </w:pPr>
       <w:r>
-        <w:t>المصدر: World Bank | سُحب: 2026-07-02 | ثقة: 0.0</w:t>
+        <w:t>المصدر: World Bank | سُحب: 2026-07-05 | ثقة: 0.0</w:t>
       </w:r>
     </w:p>
     <w:p>
@@ -416,7 +416,7 @@
         <w:pStyle w:val="IntenseQuote"/>
       </w:pPr>
       <w:r>
-        <w:t>المصدر: UN Comtrade | سُحب: 2026-07-02 | ثقة: 0.0</w:t>
+        <w:t>المصدر: UN Comtrade | سُحب: 2026-07-05 | ثقة: 0.0</w:t>
       </w:r>
     </w:p>
     <w:p>
@@ -437,7 +437,7 @@
         <w:pStyle w:val="IntenseQuote"/>
       </w:pPr>
       <w:r>
-        <w:t>المصدر: UN Comtrade | سُحب: 2026-07-02 | ثقة: 0.0</w:t>
+        <w:t>المصدر: UN Comtrade | سُحب: 2026-07-05 | ثقة: 0.0</w:t>
       </w:r>
     </w:p>
     <w:p>
@@ -450,7 +450,7 @@
         <w:pStyle w:val="IntenseQuote"/>
       </w:pPr>
       <w:r>
-        <w:t>المصدر: UN Comtrade | سُحب: 2026-07-02 | ثقة: 0.0</w:t>
+        <w:t>المصدر: UN Comtrade | سُحب: 2026-07-05 | ثقة: 0.0</w:t>
       </w:r>
     </w:p>
     <w:p>
@@ -463,7 +463,7 @@
         <w:pStyle w:val="IntenseQuote"/>
       </w:pPr>
       <w:r>
-        <w:t>المصدر: World Bank | سُحب: 2026-07-02 | ثقة: 0.0</w:t>
+        <w:t>المصدر: World Bank | سُحب: 2026-07-05 | ثقة: 0.0</w:t>
       </w:r>
     </w:p>
     <w:p>
@@ -476,7 +476,7 @@
         <w:pStyle w:val="IntenseQuote"/>
       </w:pPr>
       <w:r>
-        <w:t>المصدر: UN Comtrade | سُحب: 2026-07-02 | ثقة: 0.0</w:t>
+        <w:t>المصدر: UN Comtrade | سُحب: 2026-07-05 | ثقة: 0.0</w:t>
       </w:r>
     </w:p>
     <w:p>
@@ -497,7 +497,7 @@
         <w:pStyle w:val="IntenseQuote"/>
       </w:pPr>
       <w:r>
-        <w:t>المصدر: UN Comtrade | سُحب: 2026-07-02 | ثقة: 0.0</w:t>
+        <w:t>المصدر: UN Comtrade | سُحب: 2026-07-05 | ثقة: 0.0</w:t>
       </w:r>
     </w:p>
     <w:p>
@@ -510,7 +510,7 @@
         <w:pStyle w:val="IntenseQuote"/>
       </w:pPr>
       <w:r>
-        <w:t>المصدر: UN Comtrade | سُحب: 2026-07-02 | ثقة: 0.0</w:t>
+        <w:t>المصدر: UN Comtrade | سُحب: 2026-07-05 | ثقة: 0.0</w:t>
       </w:r>
     </w:p>
     <w:p>
@@ -523,7 +523,7 @@
         <w:pStyle w:val="IntenseQuote"/>
       </w:pPr>
       <w:r>
-        <w:t>المصدر: World Bank | سُحب: 2026-07-02 | ثقة: 0.0</w:t>
+        <w:t>المصدر: World Bank | سُحب: 2026-07-05 | ثقة: 0.0</w:t>
       </w:r>
     </w:p>
     <w:p>
@@ -536,7 +536,7 @@
         <w:pStyle w:val="IntenseQuote"/>
       </w:pPr>
       <w:r>
-        <w:t>المصدر: UN Comtrade | سُحب: 2026-07-02 | ثقة: 0.0</w:t>
+        <w:t>المصدر: UN Comtrade | سُحب: 2026-07-05 | ثقة: 0.0</w:t>
       </w:r>
     </w:p>
     <w:p>
@@ -557,7 +557,7 @@
         <w:pStyle w:val="IntenseQuote"/>
       </w:pPr>
       <w:r>
-        <w:t>المصدر: UN Comtrade | سُحب: 2026-07-02 | ثقة: 0.0</w:t>
+        <w:t>المصدر: UN Comtrade | سُحب: 2026-07-05 | ثقة: 0.0</w:t>
       </w:r>
     </w:p>
     <w:p>
@@ -570,7 +570,7 @@
         <w:pStyle w:val="IntenseQuote"/>
       </w:pPr>
       <w:r>
-        <w:t>المصدر: UN Comtrade | سُحب: 2026-07-02 | ثقة: 0.0</w:t>
+        <w:t>المصدر: UN Comtrade | سُحب: 2026-07-05 | ثقة: 0.0</w:t>
       </w:r>
     </w:p>
     <w:p>
@@ -583,7 +583,7 @@
         <w:pStyle w:val="IntenseQuote"/>
       </w:pPr>
       <w:r>
-        <w:t>المصدر: World Bank | سُحب: 2026-07-02 | ثقة: 0.0</w:t>
+        <w:t>المصدر: World Bank | سُحب: 2026-07-05 | ثقة: 0.0</w:t>
       </w:r>
     </w:p>
     <w:p>
@@ -596,7 +596,7 @@
         <w:pStyle w:val="IntenseQuote"/>
       </w:pPr>
       <w:r>
-        <w:t>المصدر: UN Comtrade | سُحب: 2026-07-02 | ثقة: 0.0</w:t>
+        <w:t>المصدر: UN Comtrade | سُحب: 2026-07-05 | ثقة: 0.0</w:t>
       </w:r>
     </w:p>
     <w:p>

</xml_diff>

<commit_message>
Fix 3rd client-docx 501: mechanical sanitizer-coverage lock + visible error detail (#106)
Three Arabic guard triggers had no sanitizer counterpart ("استدعاء أداة",
"بوابة الجودة", "بلا استشهاد") — any writer prose touching one killed the
whole client Word export with 501. New mechanical lock extracts every Arabic
literal from the guard patterns themselves and asserts the sanitizer
neutralizes each (a new guard pattern without a substitution now fails the
build). dpN citation ids covered too. dlReport/dlFail now surface the 501
body detail (which names the rejected term) instead of a bare "HTTP 501".
LESSONS.md row 11 + anchor. Samples regenerated. Suite: 1041 -> 1045.
</commit_message>
<xml_diff>
--- a/samples/report_full_latest.docx
+++ b/samples/report_full_latest.docx
@@ -175,7 +175,7 @@
           </w:tcPr>
           <w:p>
             <w:r>
-              <w:t>2026-07-15</w:t>
+              <w:t>2026-07-16</w:t>
             </w:r>
           </w:p>
         </w:tc>
@@ -972,7 +972,7 @@
           </w:tcPr>
           <w:p>
             <w:r>
-              <w:t>UN Comtrade | سُحب: 2026-07-15 | ثقة: عالية (90%)</w:t>
+              <w:t>UN Comtrade | سُحب: 2026-07-16 | ثقة: عالية (90%)</w:t>
             </w:r>
           </w:p>
         </w:tc>
@@ -1018,7 +1018,7 @@
           </w:tcPr>
           <w:p>
             <w:r>
-              <w:t>UN Comtrade (مخزن الحقائق) | سُحب: 2026-07-15 | ثقة: عالية (90%)</w:t>
+              <w:t>UN Comtrade (مخزن الحقائق) | سُحب: 2026-07-16 | ثقة: عالية (90%)</w:t>
             </w:r>
           </w:p>
         </w:tc>
@@ -1060,7 +1060,7 @@
           </w:tcPr>
           <w:p>
             <w:r>
-              <w:t>UN Comtrade (مخزن الحقائق) | سُحب: 2026-07-15 | ثقة: عالية (90%)</w:t>
+              <w:t>UN Comtrade (مخزن الحقائق) | سُحب: 2026-07-16 | ثقة: عالية (90%)</w:t>
             </w:r>
           </w:p>
         </w:tc>
@@ -1495,7 +1495,7 @@
           </w:tcPr>
           <w:p>
             <w:r>
-              <w:t>UN Comtrade | سُحب: 2026-07-15 | ثقة: عالية (90%)</w:t>
+              <w:t>UN Comtrade | سُحب: 2026-07-16 | ثقة: عالية (90%)</w:t>
             </w:r>
           </w:p>
         </w:tc>
@@ -1540,7 +1540,7 @@
           </w:tcPr>
           <w:p>
             <w:r>
-              <w:t>UN Comtrade | سُحب: 2026-07-15 | ثقة: عالية (90%)</w:t>
+              <w:t>UN Comtrade | سُحب: 2026-07-16 | ثقة: عالية (90%)</w:t>
             </w:r>
           </w:p>
         </w:tc>
@@ -1583,7 +1583,7 @@
           </w:tcPr>
           <w:p>
             <w:r>
-              <w:t>UN Comtrade | سُحب: 2026-07-15 | ثقة: عالية (90%)</w:t>
+              <w:t>UN Comtrade | سُحب: 2026-07-16 | ثقة: عالية (90%)</w:t>
             </w:r>
           </w:p>
         </w:tc>
@@ -1840,7 +1840,7 @@
           </w:tcPr>
           <w:p>
             <w:r>
-              <w:t>UN Comtrade (مخزن الحقائق) | سُحب: 2026-07-15 | ثقة: عالية (90%)</w:t>
+              <w:t>UN Comtrade (مخزن الحقائق) | سُحب: 2026-07-16 | ثقة: عالية (90%)</w:t>
             </w:r>
           </w:p>
         </w:tc>
@@ -1886,7 +1886,7 @@
           </w:tcPr>
           <w:p>
             <w:r>
-              <w:t>UN Comtrade (مخزن الحقائق) | سُحب: 2026-07-15 | ثقة: عالية (85%)</w:t>
+              <w:t>UN Comtrade (مخزن الحقائق) | سُحب: 2026-07-16 | ثقة: عالية (85%)</w:t>
             </w:r>
           </w:p>
         </w:tc>
@@ -2225,7 +2225,7 @@
         <w:pStyle w:val="IntenseQuote"/>
       </w:pPr>
       <w:r>
-        <w:t>المصدر: Silk L1 requirements reference (official portals / EUR-Lex) | سُحب: 2026-07-15 | ثقة: عالية (80%)</w:t>
+        <w:t>المصدر: Silk L1 requirements reference (official portals / EUR-Lex) | سُحب: 2026-07-16 | ثقة: عالية (80%)</w:t>
       </w:r>
     </w:p>
     <w:p>
@@ -2867,7 +2867,7 @@
     </w:p>
     <w:p>
       <w:r>
-        <w:t>Pew Research Center (لقطة ساكنة مقرّبة): أسهم 4 من 4 محاولة</w:t>
+        <w:t>Pew Research Center (لقطة ساكنة مقرّبة): أسهم 2 من 2 محاولة</w:t>
       </w:r>
     </w:p>
     <w:p>

</xml_diff>